<commit_message>
📄 Actualizar registro Word [15-03-2026 20:57]
</commit_message>
<xml_diff>
--- a/registro_2026.docx
+++ b/registro_2026.docx
@@ -11691,7 +11691,7 @@
                 <w:sz w:val="18"/>
                 <w:szCs w:val="18"/>
               </w:rPr>
-              <w:t xml:space="preserve">06-01-26</w:t>
+              <w:t xml:space="preserve">09-03-26</w:t>
             </w:r>
           </w:p>
         </w:tc>
@@ -11999,7 +11999,7 @@
                 <w:sz w:val="18"/>
                 <w:szCs w:val="18"/>
               </w:rPr>
-              <w:t xml:space="preserve"/>
+              <w:t xml:space="preserve">09-03-26</w:t>
             </w:r>
           </w:p>
         </w:tc>
@@ -12213,7 +12213,7 @@
                 <w:sz w:val="18"/>
                 <w:szCs w:val="18"/>
               </w:rPr>
-              <w:t xml:space="preserve">02-02-26</w:t>
+              <w:t xml:space="preserve">09-03-26</w:t>
             </w:r>
           </w:p>
         </w:tc>
@@ -12591,7 +12591,7 @@
                 <w:sz w:val="18"/>
                 <w:szCs w:val="18"/>
               </w:rPr>
-              <w:t xml:space="preserve"/>
+              <w:t xml:space="preserve">09-03-26</w:t>
             </w:r>
           </w:p>
         </w:tc>
@@ -14823,7 +14823,7 @@
                 <w:sz w:val="18"/>
                 <w:szCs w:val="18"/>
               </w:rPr>
-              <w:t xml:space="preserve">19-01-26</w:t>
+              <w:t xml:space="preserve">13-03-26</w:t>
             </w:r>
           </w:p>
         </w:tc>
@@ -15131,7 +15131,7 @@
                 <w:sz w:val="18"/>
                 <w:szCs w:val="18"/>
               </w:rPr>
-              <w:t xml:space="preserve"/>
+              <w:t xml:space="preserve">13-03-26</w:t>
             </w:r>
           </w:p>
         </w:tc>
@@ -15345,7 +15345,7 @@
                 <w:sz w:val="18"/>
                 <w:szCs w:val="18"/>
               </w:rPr>
-              <w:t xml:space="preserve">03-02-26</w:t>
+              <w:t xml:space="preserve">13-03-26</w:t>
             </w:r>
           </w:p>
         </w:tc>
@@ -15723,7 +15723,7 @@
                 <w:sz w:val="18"/>
                 <w:szCs w:val="18"/>
               </w:rPr>
-              <w:t xml:space="preserve"/>
+              <w:t xml:space="preserve">13-03-26</w:t>
             </w:r>
           </w:p>
         </w:tc>

</xml_diff>

<commit_message>
📄 Actualizar registro Word [29-03-2026 23:51]
</commit_message>
<xml_diff>
--- a/registro_2026.docx
+++ b/registro_2026.docx
@@ -15937,7 +15937,7 @@
                 <w:sz w:val="18"/>
                 <w:szCs w:val="18"/>
               </w:rPr>
-              <w:t xml:space="preserve">Esteban Espinoza</w:t>
+              <w:t xml:space="preserve"/>
             </w:r>
           </w:p>
         </w:tc>
@@ -16140,7 +16140,7 @@
                 <w:sz w:val="18"/>
                 <w:szCs w:val="18"/>
               </w:rPr>
-              <w:t xml:space="preserve">14-03-26</w:t>
+              <w:t xml:space="preserve"/>
             </w:r>
           </w:p>
         </w:tc>

</xml_diff>